<commit_message>
Tidy job target, merge Cambridge/Columbia row, drop TBC GitHub link
Co-Authored-By: Claude Opus 5.5 <noreply@anthropic.com>
Claude-Session: https://claude.ai/code/session_01Wy6QccTAXhM16qGGvDf8g9
</commit_message>
<xml_diff>
--- a/resume/fde/邹志华_AI解决方案简历.docx
+++ b/resume/fde/邹志华_AI解决方案简历.docx
@@ -79,111 +79,7 @@
           <w:sz w:val="19"/>
           <w:szCs w:val="19"/>
         </w:rPr>
-        <w:t xml:space="preserve">求职意向：AI 解决方案类岗位</w:t>
-      </w:r>
-      <w:r>
-        <w:rPr>
-          <w:rFonts w:ascii="Times New Roman" w:cs="Times New Roman" w:eastAsia="Microsoft YaHei" w:hAnsi="Times New Roman"/>
-          <w:b w:val="false"/>
-          <w:bCs w:val="false"/>
-          <w:i w:val="false"/>
-          <w:iCs w:val="false"/>
-          <w:color w:val="151515"/>
-          <w:sz w:val="19"/>
-          <w:szCs w:val="19"/>
-        </w:rPr>
-        <w:t xml:space="preserve">  |  </w:t>
-      </w:r>
-      <w:r>
-        <w:rPr>
-          <w:rFonts w:ascii="Times New Roman" w:cs="Times New Roman" w:eastAsia="Microsoft YaHei" w:hAnsi="Times New Roman"/>
-          <w:b/>
-          <w:bCs/>
-          <w:i w:val="false"/>
-          <w:iCs w:val="false"/>
-          <w:color w:val="151515"/>
-          <w:sz w:val="19"/>
-          <w:szCs w:val="19"/>
-        </w:rPr>
-        <w:t xml:space="preserve">前线部署工程师（FDE）</w:t>
-      </w:r>
-      <w:r>
-        <w:rPr>
-          <w:rFonts w:ascii="Times New Roman" w:cs="Times New Roman" w:eastAsia="Times New Roman" w:hAnsi="Times New Roman"/>
-          <w:b/>
-          <w:bCs/>
-          <w:i w:val="false"/>
-          <w:iCs w:val="false"/>
-          <w:color w:val="151515"/>
-          <w:sz w:val="19"/>
-          <w:szCs w:val="19"/>
-        </w:rPr>
-        <w:t xml:space="preserve">·</w:t>
-      </w:r>
-      <w:r>
-        <w:rPr>
-          <w:rFonts w:ascii="Times New Roman" w:cs="Times New Roman" w:eastAsia="Microsoft YaHei" w:hAnsi="Times New Roman"/>
-          <w:b/>
-          <w:bCs/>
-          <w:i w:val="false"/>
-          <w:iCs w:val="false"/>
-          <w:color w:val="151515"/>
-          <w:sz w:val="19"/>
-          <w:szCs w:val="19"/>
-        </w:rPr>
-        <w:t xml:space="preserve"> 解决方案工程师 </w:t>
-      </w:r>
-      <w:r>
-        <w:rPr>
-          <w:rFonts w:ascii="Times New Roman" w:cs="Times New Roman" w:eastAsia="Times New Roman" w:hAnsi="Times New Roman"/>
-          <w:b/>
-          <w:bCs/>
-          <w:i w:val="false"/>
-          <w:iCs w:val="false"/>
-          <w:color w:val="151515"/>
-          <w:sz w:val="19"/>
-          <w:szCs w:val="19"/>
-        </w:rPr>
-        <w:t xml:space="preserve">·</w:t>
-      </w:r>
-      <w:r>
-        <w:rPr>
-          <w:rFonts w:ascii="Times New Roman" w:cs="Times New Roman" w:eastAsia="Microsoft YaHei" w:hAnsi="Times New Roman"/>
-          <w:b/>
-          <w:bCs/>
-          <w:i w:val="false"/>
-          <w:iCs w:val="false"/>
-          <w:color w:val="151515"/>
-          <w:sz w:val="19"/>
-          <w:szCs w:val="19"/>
-        </w:rPr>
-        <w:t xml:space="preserve"> 解决方案架构师 </w:t>
-      </w:r>
-      <w:r>
-        <w:rPr>
-          <w:rFonts w:ascii="Times New Roman" w:cs="Times New Roman" w:eastAsia="Times New Roman" w:hAnsi="Times New Roman"/>
-          <w:b/>
-          <w:bCs/>
-          <w:i w:val="false"/>
-          <w:iCs w:val="false"/>
-          <w:color w:val="151515"/>
-          <w:sz w:val="19"/>
-          <w:szCs w:val="19"/>
-        </w:rPr>
-        <w:t xml:space="preserve">·</w:t>
-      </w:r>
-      <w:r>
-        <w:rPr>
-          <w:rFonts w:ascii="Times New Roman" w:cs="Times New Roman" w:eastAsia="Microsoft YaHei" w:hAnsi="Times New Roman"/>
-          <w:b/>
-          <w:bCs/>
-          <w:i w:val="false"/>
-          <w:iCs w:val="false"/>
-          <w:color w:val="151515"/>
-          <w:sz w:val="19"/>
-          <w:szCs w:val="19"/>
-        </w:rPr>
-        <w:t xml:space="preserve"> 实施交付</w:t>
+        <w:t xml:space="preserve">求职意向：AI 解决方案工程师 / 前线部署工程师（FDE）/ 解决方案架构师 / 实施交付顾问</w:t>
       </w:r>
     </w:p>
     <w:p>
@@ -401,7 +297,7 @@
         </w:rPr>
         <w:t xml:space="preserve"> </w:t>
       </w:r>
-      <w:hyperlink w:history="1" r:id="rIdjyw3xnjurtj-yeyttipky">
+      <w:hyperlink w:history="1" r:id="rId6wwu0-fn20jkbhdvthnat">
         <w:r>
           <w:rPr>
             <w:rFonts w:ascii="Times New Roman" w:cs="Times New Roman" w:eastAsia="Microsoft YaHei" w:hAnsi="Times New Roman"/>
@@ -920,14 +816,14 @@
         </w:rPr>
         <w:t xml:space="preserve">   Digital Transformation Research (Distinction)</w:t>
       </w:r>
-    </w:p>
-    <w:p>
-      <w:pPr>
-        <w:tabs>
-          <w:tab w:val="right" w:pos="10772"/>
-        </w:tabs>
-        <w:spacing w:line="262" w:lineRule="exact"/>
-      </w:pPr>
+      <w:r>
+        <w:rPr>
+          <w:rFonts w:ascii="Times New Roman" w:cs="Times New Roman" w:eastAsia="Microsoft YaHei" w:hAnsi="Times New Roman"/>
+          <w:sz w:val="19"/>
+          <w:szCs w:val="19"/>
+        </w:rPr>
+        <w:t xml:space="preserve">  |  </w:t>
+      </w:r>
       <w:r>
         <w:drawing>
           <wp:inline distT="0" distB="0" distL="0" distR="0">
@@ -1308,7 +1204,7 @@
           <w:ilvl w:val="0"/>
           <w:numId w:val="2"/>
         </w:numPr>
-        <w:spacing w:line="240" w:lineRule="exact"/>
+        <w:spacing w:line="244" w:lineRule="exact"/>
       </w:pPr>
       <w:r>
         <w:rPr>
@@ -1344,7 +1240,7 @@
           <w:ilvl w:val="0"/>
           <w:numId w:val="2"/>
         </w:numPr>
-        <w:spacing w:line="240" w:lineRule="exact"/>
+        <w:spacing w:line="244" w:lineRule="exact"/>
       </w:pPr>
       <w:r>
         <w:rPr>
@@ -1406,7 +1302,7 @@
           <w:ilvl w:val="0"/>
           <w:numId w:val="2"/>
         </w:numPr>
-        <w:spacing w:line="240" w:lineRule="exact"/>
+        <w:spacing w:line="244" w:lineRule="exact"/>
       </w:pPr>
       <w:r>
         <w:rPr>
@@ -1732,7 +1628,7 @@
           <w:ilvl w:val="0"/>
           <w:numId w:val="2"/>
         </w:numPr>
-        <w:spacing w:line="240" w:lineRule="exact"/>
+        <w:spacing w:line="244" w:lineRule="exact"/>
       </w:pPr>
       <w:r>
         <w:rPr>
@@ -1898,7 +1794,7 @@
           <w:ilvl w:val="0"/>
           <w:numId w:val="2"/>
         </w:numPr>
-        <w:spacing w:line="240" w:lineRule="exact"/>
+        <w:spacing w:line="244" w:lineRule="exact"/>
       </w:pPr>
       <w:r>
         <w:rPr>
@@ -2263,7 +2159,7 @@
           <w:ilvl w:val="0"/>
           <w:numId w:val="2"/>
         </w:numPr>
-        <w:spacing w:line="240" w:lineRule="exact"/>
+        <w:spacing w:line="244" w:lineRule="exact"/>
       </w:pPr>
       <w:r>
         <w:rPr>
@@ -2325,7 +2221,7 @@
           <w:ilvl w:val="0"/>
           <w:numId w:val="2"/>
         </w:numPr>
-        <w:spacing w:line="240" w:lineRule="exact"/>
+        <w:spacing w:line="244" w:lineRule="exact"/>
       </w:pPr>
       <w:r>
         <w:rPr>
@@ -2638,7 +2534,7 @@
           <w:ilvl w:val="0"/>
           <w:numId w:val="2"/>
         </w:numPr>
-        <w:spacing w:line="240" w:lineRule="exact"/>
+        <w:spacing w:line="244" w:lineRule="exact"/>
       </w:pPr>
       <w:r>
         <w:rPr>
@@ -2983,7 +2879,7 @@
         </w:rPr>
         <w:t xml:space="preserve">	</w:t>
       </w:r>
-      <w:hyperlink w:history="1" r:id="rIdwp5qcxsxh32aehpuolosu">
+      <w:hyperlink w:history="1" r:id="rIdul8ttxbgzuugiciht6c6q">
         <w:r>
           <w:rPr>
             <w:rFonts w:ascii="Times New Roman" w:cs="Times New Roman" w:eastAsia="Microsoft YaHei" w:hAnsi="Times New Roman"/>
@@ -3024,47 +2920,6 @@
           <w:t xml:space="preserve">   </w:t>
         </w:r>
       </w:hyperlink>
-      <w:hyperlink w:history="1" r:id="rIdjzjnk0tgj82naiee4eyzo">
-        <w:r>
-          <w:rPr>
-            <w:rFonts w:ascii="Times New Roman" w:cs="Times New Roman" w:eastAsia="Microsoft YaHei" w:hAnsi="Times New Roman"/>
-            <w:b/>
-            <w:bCs/>
-            <w:i w:val="false"/>
-            <w:iCs w:val="false"/>
-            <w:color w:val="2458B8"/>
-            <w:sz w:val="19"/>
-            <w:szCs w:val="19"/>
-          </w:rPr>
-          <w:t xml:space="preserve">GitHub </w:t>
-        </w:r>
-        <w:r>
-          <w:rPr>
-            <w:rFonts w:ascii="Segoe UI Symbol" w:cs="Segoe UI Symbol" w:eastAsia="Segoe UI Symbol" w:hAnsi="Segoe UI Symbol"/>
-            <w:b/>
-            <w:bCs/>
-            <w:i w:val="false"/>
-            <w:iCs w:val="false"/>
-            <w:color w:val="2458B8"/>
-            <w:sz w:val="19"/>
-            <w:szCs w:val="19"/>
-          </w:rPr>
-          <w:t xml:space="preserve">↗</w:t>
-        </w:r>
-        <w:r>
-          <w:rPr>
-            <w:rFonts w:ascii="Times New Roman" w:cs="Times New Roman" w:eastAsia="Microsoft YaHei" w:hAnsi="Times New Roman"/>
-            <w:b/>
-            <w:bCs/>
-            <w:i w:val="false"/>
-            <w:iCs w:val="false"/>
-            <w:color w:val="2458B8"/>
-            <w:sz w:val="19"/>
-            <w:szCs w:val="19"/>
-          </w:rPr>
-          <w:t xml:space="preserve">   </w:t>
-        </w:r>
-      </w:hyperlink>
       <w:r>
         <w:rPr>
           <w:rFonts w:ascii="Times New Roman" w:cs="Times New Roman" w:eastAsia="Microsoft YaHei" w:hAnsi="Times New Roman"/>
@@ -3234,7 +3089,7 @@
           <w:ilvl w:val="0"/>
           <w:numId w:val="2"/>
         </w:numPr>
-        <w:spacing w:line="240" w:lineRule="exact"/>
+        <w:spacing w:line="244" w:lineRule="exact"/>
       </w:pPr>
       <w:r>
         <w:rPr>
@@ -3400,7 +3255,7 @@
           <w:ilvl w:val="0"/>
           <w:numId w:val="2"/>
         </w:numPr>
-        <w:spacing w:line="240" w:lineRule="exact"/>
+        <w:spacing w:line="244" w:lineRule="exact"/>
       </w:pPr>
       <w:r>
         <w:rPr>
@@ -3540,7 +3395,7 @@
           <w:ilvl w:val="0"/>
           <w:numId w:val="2"/>
         </w:numPr>
-        <w:spacing w:line="240" w:lineRule="exact"/>
+        <w:spacing w:line="244" w:lineRule="exact"/>
       </w:pPr>
       <w:r>
         <w:rPr>
@@ -3931,7 +3786,7 @@
           <w:ilvl w:val="0"/>
           <w:numId w:val="2"/>
         </w:numPr>
-        <w:spacing w:line="240" w:lineRule="exact"/>
+        <w:spacing w:line="244" w:lineRule="exact"/>
       </w:pPr>
       <w:r>
         <w:rPr>
@@ -4097,7 +3952,7 @@
           <w:ilvl w:val="0"/>
           <w:numId w:val="2"/>
         </w:numPr>
-        <w:spacing w:line="240" w:lineRule="exact"/>
+        <w:spacing w:line="244" w:lineRule="exact"/>
       </w:pPr>
       <w:r>
         <w:rPr>
@@ -4159,7 +4014,7 @@
           <w:ilvl w:val="0"/>
           <w:numId w:val="2"/>
         </w:numPr>
-        <w:spacing w:line="240" w:lineRule="exact"/>
+        <w:spacing w:line="244" w:lineRule="exact"/>
       </w:pPr>
       <w:r>
         <w:rPr>
@@ -4563,7 +4418,7 @@
           <w:ilvl w:val="0"/>
           <w:numId w:val="2"/>
         </w:numPr>
-        <w:spacing w:line="240" w:lineRule="exact"/>
+        <w:spacing w:line="244" w:lineRule="exact"/>
       </w:pPr>
       <w:r>
         <w:rPr>
@@ -4651,7 +4506,7 @@
           <w:ilvl w:val="0"/>
           <w:numId w:val="2"/>
         </w:numPr>
-        <w:spacing w:line="240" w:lineRule="exact"/>
+        <w:spacing w:line="244" w:lineRule="exact"/>
       </w:pPr>
       <w:r>
         <w:rPr>
@@ -4886,7 +4741,7 @@
         </w:rPr>
         <w:t xml:space="preserve">	</w:t>
       </w:r>
-      <w:hyperlink w:history="1" r:id="rIdupxwwcmxhuhw4a03hrjip">
+      <w:hyperlink w:history="1" r:id="rIdvvefivitoopqw25mpnvan">
         <w:r>
           <w:rPr>
             <w:rFonts w:ascii="Times New Roman" w:cs="Times New Roman" w:eastAsia="Microsoft YaHei" w:hAnsi="Times New Roman"/>
@@ -4974,7 +4829,7 @@
           <w:ilvl w:val="0"/>
           <w:numId w:val="2"/>
         </w:numPr>
-        <w:spacing w:line="240" w:lineRule="exact"/>
+        <w:spacing w:line="244" w:lineRule="exact"/>
       </w:pPr>
       <w:r>
         <w:rPr>
@@ -5224,7 +5079,7 @@
           <w:ilvl w:val="0"/>
           <w:numId w:val="2"/>
         </w:numPr>
-        <w:spacing w:line="240" w:lineRule="exact"/>
+        <w:spacing w:line="244" w:lineRule="exact"/>
       </w:pPr>
       <w:r>
         <w:rPr>
@@ -5260,7 +5115,7 @@
           <w:ilvl w:val="0"/>
           <w:numId w:val="2"/>
         </w:numPr>
-        <w:spacing w:line="240" w:lineRule="exact"/>
+        <w:spacing w:line="244" w:lineRule="exact"/>
       </w:pPr>
       <w:r>
         <w:rPr>
@@ -5348,7 +5203,7 @@
           <w:ilvl w:val="0"/>
           <w:numId w:val="2"/>
         </w:numPr>
-        <w:spacing w:line="240" w:lineRule="exact"/>
+        <w:spacing w:line="244" w:lineRule="exact"/>
       </w:pPr>
       <w:r>
         <w:rPr>

</xml_diff>